<commit_message>
Rename the project to INFINITE-APPROXIMATION
The page title, header, footer, page description, README, INSTRUCTIONS
and the code walkthrough (docs/Code-Walkthrough.docx) now say
INFINITE-APPROXIMATION, and the links point at the renamed repository
and its new GitHub Pages address. What the tool does is unchanged:
orthogonal trajectories of a family of curves, all maths in C++.
</commit_message>
<xml_diff>
--- a/docs/Code-Walkthrough.docx
+++ b/docs/Code-Walkthrough.docx
@@ -15,7 +15,7 @@
           <w:sz w:val="44"/>
           <w:szCs w:val="44"/>
         </w:rPr>
-        <w:t xml:space="preserve">Orthogonal - IOI</w:t>
+        <w:t xml:space="preserve">INFINITE-APPROXIMATION</w:t>
       </w:r>
     </w:p>
     <w:p>
@@ -42,7 +42,7 @@
           <w:sz w:val="22"/>
           <w:szCs w:val="22"/>
         </w:rPr>
-        <w:t xml:space="preserve">Type a family of curves and see its orthogonal trajectories. Live site: https://ali-ioi.github.io/ORTHOGONAL-IOI/</w:t>
+        <w:t xml:space="preserve">Type a family of curves and see its orthogonal trajectories. Live site: https://ali-ioi.github.io/INFINITE-APPROXIMATION/</w:t>
       </w:r>
     </w:p>
     <w:p>
@@ -2641,7 +2641,7 @@
         <w:sz w:val="18"/>
         <w:szCs w:val="18"/>
       </w:rPr>
-      <w:t xml:space="preserve">Orthogonal - IOI · code walkthrough · page </w:t>
+      <w:t xml:space="preserve">INFINITE-APPROXIMATION · code walkthrough · page </w:t>
     </w:r>
     <w:r>
       <w:rPr>

</xml_diff>